<commit_message>
chore: bump version to 0.3.1 and record STD test logs
- pyproject and sonar version 0.3.0 -> 0.3.1
- STD section 4: environment, logs and summary for 3.1-3.5, 3.7, 3.9
  (Enes, macOS); 3.6 and 3.8 are left for Burak (cross-test rule)
- docs/std/v0.3.1: GUI driver script, screenshots, raw results, 3.9 CLI log

Co-Authored-By: Claude Opus 5.5 <noreply@anthropic.com>
</commit_message>
<xml_diff>
--- a/docs/TestZede-STD.docx
+++ b/docs/TestZede-STD.docx
@@ -8580,7 +8580,15 @@
               <w:spacing w:after="0"/>
             </w:pPr>
             <w:r>
-              <w:t>İşletim sistemi: ………………   Python sürümü: ………   Yazılım sürümü: ………</w:t>
+              <w:t>İşletim sistemi: macOS 27.0   Python sürümü: 3.11.16   Yazılım sürümü: v0.3.1 adayı (develop 75f0665 + PR #27)</w:t>
+            </w:r>
+          </w:p>
+          <w:p>
+            <w:pPr>
+              <w:spacing w:after="0"/>
+            </w:pPr>
+            <w:r>
+              <w:t>3.1–3.5 ve 3.7: arayüz (MainWindow) STD girdileriyle Qt üzerinden betikle sürüldü; “Dosya Aç” / “CSV’ye Aktar…” iletişim kutularının seçtiği yol doğrudan verildi. 3.9: komut satırı, boş bir veri klasöründe (--data-dir). Ekran görüntüleri ve ham sonuçlar: docs/std/v0.3.1/. 3.6 ve 3.8 çapraz test kuralı gereği Burak Arıkan tarafından (Windows) doldurulacak.</w:t>
             </w:r>
           </w:p>
         </w:tc>
@@ -8637,7 +8645,7 @@
               <w:spacing w:after="0"/>
             </w:pPr>
             <w:r>
-              <w:t>………………………………………   ……/……/……</w:t>
+              <w:t>Enes Öztürk (3.1–3.5, 3.7, 3.9)   21/10/2026</w:t>
             </w:r>
           </w:p>
         </w:tc>
@@ -8906,6 +8914,9 @@
             <w:pPr>
               <w:spacing w:after="0"/>
             </w:pPr>
+            <w:r>
+              <w:t>Tamam: yeşil “Kod geçerli. Üst düzey fonksiyonlar: sign”.</w:t>
+            </w:r>
           </w:p>
         </w:tc>
         <w:tc>
@@ -8928,6 +8939,9 @@
             <w:pPr>
               <w:spacing w:after="0"/>
             </w:pPr>
+            <w:r>
+              <w:t>G</w:t>
+            </w:r>
           </w:p>
         </w:tc>
       </w:tr>
@@ -9007,6 +9021,9 @@
             <w:pPr>
               <w:spacing w:after="0"/>
             </w:pPr>
+            <w:r>
+              <w:t>Tamam: “3 test bulundu: test_positive, test_negative, test_zero”.</w:t>
+            </w:r>
           </w:p>
         </w:tc>
         <w:tc>
@@ -9029,6 +9046,9 @@
             <w:pPr>
               <w:spacing w:after="0"/>
             </w:pPr>
+            <w:r>
+              <w:t>G</w:t>
+            </w:r>
           </w:p>
         </w:tc>
       </w:tr>
@@ -9108,6 +9128,9 @@
             <w:pPr>
               <w:spacing w:after="0"/>
             </w:pPr>
+            <w:r>
+              <w:t>Tamam: sign.py editöre yüklendi, kod geçerli, modül adı “sign”.</w:t>
+            </w:r>
           </w:p>
         </w:tc>
         <w:tc>
@@ -9130,6 +9153,9 @@
             <w:pPr>
               <w:spacing w:after="0"/>
             </w:pPr>
+            <w:r>
+              <w:t>G</w:t>
+            </w:r>
           </w:p>
         </w:tc>
       </w:tr>
@@ -9210,6 +9236,9 @@
             <w:pPr>
               <w:spacing w:after="0"/>
             </w:pPr>
+            <w:r>
+              <w:t>Tamam: Çağrı Grafiği’nde “Kod Yükle sayfasındaki kod (6 satır).” görünüyor.</w:t>
+            </w:r>
           </w:p>
         </w:tc>
         <w:tc>
@@ -9232,6 +9261,9 @@
             <w:pPr>
               <w:spacing w:after="0"/>
             </w:pPr>
+            <w:r>
+              <w:t>G</w:t>
+            </w:r>
           </w:p>
         </w:tc>
       </w:tr>
@@ -9489,6 +9521,9 @@
             <w:pPr>
               <w:spacing w:after="0"/>
             </w:pPr>
+            <w:r>
+              <w:t>Tamam: kırmızı “Satır 1: invalid syntax (Önceki geçerli kod korunuyor.)”.</w:t>
+            </w:r>
           </w:p>
         </w:tc>
         <w:tc>
@@ -9511,6 +9546,9 @@
             <w:pPr>
               <w:spacing w:after="0"/>
             </w:pPr>
+            <w:r>
+              <w:t>G</w:t>
+            </w:r>
           </w:p>
         </w:tc>
       </w:tr>
@@ -9590,6 +9628,9 @@
             <w:pPr>
               <w:spacing w:after="0"/>
             </w:pPr>
+            <w:r>
+              <w:t>Tamam: H1 ve boş kodda K1 korunuyor; boş kodda “Kod boş. …” mesajı.</w:t>
+            </w:r>
           </w:p>
         </w:tc>
         <w:tc>
@@ -9612,6 +9653,9 @@
             <w:pPr>
               <w:spacing w:after="0"/>
             </w:pPr>
+            <w:r>
+              <w:t>G</w:t>
+            </w:r>
           </w:p>
         </w:tc>
       </w:tr>
@@ -9691,6 +9735,9 @@
             <w:pPr>
               <w:spacing w:after="0"/>
             </w:pPr>
+            <w:r>
+              <w:t>Tamam: Çağrı Grafiği, Metrikler ve Coverage’da düğme kapalı, “Kaynak kod yok. Önce ‘Kod Yükle’ sayfasında …” yazıyor.</w:t>
+            </w:r>
           </w:p>
         </w:tc>
         <w:tc>
@@ -9713,6 +9760,9 @@
             <w:pPr>
               <w:spacing w:after="0"/>
             </w:pPr>
+            <w:r>
+              <w:t>G</w:t>
+            </w:r>
           </w:p>
         </w:tc>
       </w:tr>
@@ -9792,6 +9842,9 @@
             <w:pPr>
               <w:spacing w:after="0"/>
             </w:pPr>
+            <w:r>
+              <w:t>Tamam: “Dosya UTF-8 olarak okunamadı (bayt 5). …” (cp1254 dosya); olmayan dosyada “Dosya bulunamadı: …”.</w:t>
+            </w:r>
           </w:p>
         </w:tc>
         <w:tc>
@@ -9814,6 +9867,9 @@
             <w:pPr>
               <w:spacing w:after="0"/>
             </w:pPr>
+            <w:r>
+              <w:t>G</w:t>
+            </w:r>
           </w:p>
         </w:tc>
       </w:tr>
@@ -9893,6 +9949,9 @@
             <w:pPr>
               <w:spacing w:after="0"/>
             </w:pPr>
+            <w:r>
+              <w:t>Hayır: kapanma/donma yok, yakalanmamış istisna 0.</w:t>
+            </w:r>
           </w:p>
         </w:tc>
         <w:tc>
@@ -9915,6 +9974,9 @@
             <w:pPr>
               <w:spacing w:after="0"/>
             </w:pPr>
+            <w:r>
+              <w:t>G</w:t>
+            </w:r>
           </w:p>
         </w:tc>
       </w:tr>
@@ -10172,6 +10234,9 @@
             <w:pPr>
               <w:spacing w:after="0"/>
             </w:pPr>
+            <w:r>
+              <w:t>Tamam: fact, main / len, print, str / math.sqrt / &lt;module&gt; (2 fonksiyon, 3 yerleşik, 1 harici, 1 modül).</w:t>
+            </w:r>
           </w:p>
         </w:tc>
         <w:tc>
@@ -10194,6 +10259,9 @@
             <w:pPr>
               <w:spacing w:after="0"/>
             </w:pPr>
+            <w:r>
+              <w:t>G</w:t>
+            </w:r>
           </w:p>
         </w:tc>
       </w:tr>
@@ -10273,6 +10341,9 @@
             <w:pPr>
               <w:spacing w:after="0"/>
             </w:pPr>
+            <w:r>
+              <w:t>Tamam: “… · 7 çağrı · özyinelemeli: fact”; fact üzerinde halka ok çizili.</w:t>
+            </w:r>
           </w:p>
         </w:tc>
         <w:tc>
@@ -10295,6 +10366,9 @@
             <w:pPr>
               <w:spacing w:after="0"/>
             </w:pPr>
+            <w:r>
+              <w:t>G</w:t>
+            </w:r>
           </w:p>
         </w:tc>
       </w:tr>
@@ -10374,6 +10448,9 @@
             <w:pPr>
               <w:spacing w:after="0"/>
             </w:pPr>
+            <w:r>
+              <w:t>Tamam: tabloda main seçilince grafikte vurgulandı; grafikte fact’e tıklanınca tablo ve ayrıntı satırı güncellendi.</w:t>
+            </w:r>
           </w:p>
         </w:tc>
         <w:tc>
@@ -10396,6 +10473,9 @@
             <w:pPr>
               <w:spacing w:after="0"/>
             </w:pPr>
+            <w:r>
+              <w:t>G</w:t>
+            </w:r>
           </w:p>
         </w:tc>
       </w:tr>
@@ -10475,6 +10555,9 @@
             <w:pPr>
               <w:spacing w:after="0"/>
             </w:pPr>
+            <w:r>
+              <w:t>Tamam: HumanEval/0 için grafik çizildi (3 düğüm, 2 çağrı; 164 görev listelendi).</w:t>
+            </w:r>
           </w:p>
         </w:tc>
         <w:tc>
@@ -10497,6 +10580,9 @@
             <w:pPr>
               <w:spacing w:after="0"/>
             </w:pPr>
+            <w:r>
+              <w:t>G</w:t>
+            </w:r>
           </w:p>
         </w:tc>
       </w:tr>
@@ -10754,6 +10840,9 @@
             <w:pPr>
               <w:spacing w:after="0"/>
             </w:pPr>
+            <w:r>
+              <w:t>Tamam: 14 satır.</w:t>
+            </w:r>
           </w:p>
         </w:tc>
         <w:tc>
@@ -10776,6 +10865,9 @@
             <w:pPr>
               <w:spacing w:after="0"/>
             </w:pPr>
+            <w:r>
+              <w:t>G</w:t>
+            </w:r>
           </w:p>
         </w:tc>
       </w:tr>
@@ -10856,6 +10948,9 @@
             <w:pPr>
               <w:spacing w:after="0"/>
             </w:pPr>
+            <w:r>
+              <w:t>Tamam: LOC/LLOC/SLOC 6, Yorum/Çoklu/Boş 0, Zorluk 2.50, Çaba 51.70, Uzunluk 8, Zaman 2.87, Kelime Haznesi 6, Hacim 20.68, Karmaşıklık 3, MI 73.41.</w:t>
+            </w:r>
           </w:p>
         </w:tc>
         <w:tc>
@@ -10878,6 +10973,9 @@
             <w:pPr>
               <w:spacing w:after="0"/>
             </w:pPr>
+            <w:r>
+              <w:t>G</w:t>
+            </w:r>
           </w:p>
         </w:tc>
       </w:tr>
@@ -10957,6 +11055,9 @@
             <w:pPr>
               <w:spacing w:after="0"/>
             </w:pPr>
+            <w:r>
+              <w:t>Tamam: “Sürdürülebilirlik: A (yüksek)”.</w:t>
+            </w:r>
           </w:p>
         </w:tc>
         <w:tc>
@@ -10979,6 +11080,9 @@
             <w:pPr>
               <w:spacing w:after="0"/>
             </w:pPr>
+            <w:r>
+              <w:t>G</w:t>
+            </w:r>
           </w:p>
         </w:tc>
       </w:tr>
@@ -11058,6 +11162,9 @@
             <w:pPr>
               <w:spacing w:after="0"/>
             </w:pPr>
+            <w:r>
+              <w:t>Tamam: 15 satır (başlık + 14), UTF-8 BOM’lu; Türkçe karakterler bozulmuyor.</w:t>
+            </w:r>
           </w:p>
         </w:tc>
         <w:tc>
@@ -11080,6 +11187,9 @@
             <w:pPr>
               <w:spacing w:after="0"/>
             </w:pPr>
+            <w:r>
+              <w:t>G</w:t>
+            </w:r>
           </w:p>
         </w:tc>
       </w:tr>
@@ -11337,6 +11447,9 @@
             <w:pPr>
               <w:spacing w:after="0"/>
             </w:pPr>
+            <w:r>
+              <w:t>Tamam: Satır 50.0% (3/6), Dal 25.0% (1/4); test_positive “Geçti”.</w:t>
+            </w:r>
           </w:p>
         </w:tc>
         <w:tc>
@@ -11359,6 +11472,9 @@
             <w:pPr>
               <w:spacing w:after="0"/>
             </w:pPr>
+            <w:r>
+              <w:t>G</w:t>
+            </w:r>
           </w:p>
         </w:tc>
       </w:tr>
@@ -11438,6 +11554,9 @@
             <w:pPr>
               <w:spacing w:after="0"/>
             </w:pPr>
+            <w:r>
+              <w:t>Tamam: Satır 100.0% (6/6), Dal 100.0% (4/4); üç test “Geçti”.</w:t>
+            </w:r>
           </w:p>
         </w:tc>
         <w:tc>
@@ -11460,6 +11579,9 @@
             <w:pPr>
               <w:spacing w:after="0"/>
             </w:pPr>
+            <w:r>
+              <w:t>G</w:t>
+            </w:r>
           </w:p>
         </w:tc>
       </w:tr>
@@ -11539,6 +11661,9 @@
             <w:pPr>
               <w:spacing w:after="0"/>
             </w:pPr>
+            <w:r>
+              <w:t>Tamam: 4–6. satırlar kırmızı, 2. satır kısmi (turuncu), diğerleri yeşil.</w:t>
+            </w:r>
           </w:p>
         </w:tc>
         <w:tc>
@@ -11561,6 +11686,9 @@
             <w:pPr>
               <w:spacing w:after="0"/>
             </w:pPr>
+            <w:r>
+              <w:t>G</w:t>
+            </w:r>
           </w:p>
         </w:tc>
       </w:tr>
@@ -11640,6 +11768,9 @@
             <w:pPr>
               <w:spacing w:after="0"/>
             </w:pPr>
+            <w:r>
+              <w:t>Tamam: ~10 sn sonra test_loop “Zaman aşımı”; arayüz yanıt veriyor. Not: aynı çalıştırmadaki diğer testler de “Zaman aşımı” görünüyor (tek sandbox süreci).</w:t>
+            </w:r>
           </w:p>
         </w:tc>
         <w:tc>
@@ -11662,6 +11793,9 @@
             <w:pPr>
               <w:spacing w:after="0"/>
             </w:pPr>
+            <w:r>
+              <w:t>G</w:t>
+            </w:r>
           </w:p>
         </w:tc>
       </w:tr>
@@ -12602,6 +12736,9 @@
             <w:pPr>
               <w:spacing w:after="0"/>
             </w:pPr>
+            <w:r>
+              <w:t>Tamam: “Skor: 90.0%” (10 mutant: 9 öldürülen, 1 hayatta kalan, 0 atlanan).</w:t>
+            </w:r>
           </w:p>
         </w:tc>
         <w:tc>
@@ -12624,6 +12761,9 @@
             <w:pPr>
               <w:spacing w:after="0"/>
             </w:pPr>
+            <w:r>
+              <w:t>G</w:t>
+            </w:r>
           </w:p>
         </w:tc>
       </w:tr>
@@ -12704,6 +12844,9 @@
             <w:pPr>
               <w:spacing w:after="0"/>
             </w:pPr>
+            <w:r>
+              <w:t>Tamam: CONST, satır 2, “0 -&gt; 1”.</w:t>
+            </w:r>
           </w:p>
         </w:tc>
         <w:tc>
@@ -12726,6 +12869,9 @@
             <w:pPr>
               <w:spacing w:after="0"/>
             </w:pPr>
+            <w:r>
+              <w:t>G</w:t>
+            </w:r>
           </w:p>
         </w:tc>
       </w:tr>
@@ -12805,6 +12951,9 @@
             <w:pPr>
               <w:spacing w:after="0"/>
             </w:pPr>
+            <w:r>
+              <w:t>Tamam: fark görünümünde “if x &gt; 0” → “if x &gt; 1”.</w:t>
+            </w:r>
           </w:p>
         </w:tc>
         <w:tc>
@@ -12827,6 +12976,9 @@
             <w:pPr>
               <w:spacing w:after="0"/>
             </w:pPr>
+            <w:r>
+              <w:t>G</w:t>
+            </w:r>
           </w:p>
         </w:tc>
       </w:tr>
@@ -12906,6 +13058,9 @@
             <w:pPr>
               <w:spacing w:after="0"/>
             </w:pPr>
+            <w:r>
+              <w:t>Tamam: ilerleme çubuğu güncellendi; olay döngüsünde en uzun bekleme 0.05 sn.</w:t>
+            </w:r>
           </w:p>
         </w:tc>
         <w:tc>
@@ -12928,6 +13083,9 @@
             <w:pPr>
               <w:spacing w:after="0"/>
             </w:pPr>
+            <w:r>
+              <w:t>G</w:t>
+            </w:r>
           </w:p>
         </w:tc>
       </w:tr>
@@ -13767,6 +13925,9 @@
             <w:pPr>
               <w:spacing w:after="0"/>
             </w:pPr>
+            <w:r>
+              <w:t>Tamam: üç veri seti indirildi, “hazır”; SHA-256 doğrulandı.</w:t>
+            </w:r>
           </w:p>
         </w:tc>
         <w:tc>
@@ -13789,6 +13950,9 @@
             <w:pPr>
               <w:spacing w:after="0"/>
             </w:pPr>
+            <w:r>
+              <w:t>G</w:t>
+            </w:r>
           </w:p>
         </w:tc>
       </w:tr>
@@ -13868,6 +14032,9 @@
             <w:pPr>
               <w:spacing w:after="0"/>
             </w:pPr>
+            <w:r>
+              <w:t>Tamam: “zaten indirilmiş, SHA-256 doğrulandı (yeniden indirilmedi)”.</w:t>
+            </w:r>
           </w:p>
         </w:tc>
         <w:tc>
@@ -13890,6 +14057,9 @@
             <w:pPr>
               <w:spacing w:after="0"/>
             </w:pPr>
+            <w:r>
+              <w:t>G</w:t>
+            </w:r>
           </w:p>
         </w:tc>
       </w:tr>
@@ -13969,6 +14139,9 @@
             <w:pPr>
               <w:spacing w:after="0"/>
             </w:pPr>
+            <w:r>
+              <w:t>Tamam: development 134, main 291, external 230 birim; SHA-256’lar yazıldı ve mevcut data/splits ile aynı; development–main ortak instance_id: 0.</w:t>
+            </w:r>
           </w:p>
         </w:tc>
         <w:tc>
@@ -13991,6 +14164,9 @@
             <w:pPr>
               <w:spacing w:after="0"/>
             </w:pPr>
+            <w:r>
+              <w:t>G</w:t>
+            </w:r>
           </w:p>
         </w:tc>
       </w:tr>
@@ -14070,6 +14246,9 @@
             <w:pPr>
               <w:spacing w:after="0"/>
             </w:pPr>
+            <w:r>
+              <w:t>Tamam: “Hata: Eksik veri setleri: humaneval. …”, çıkış kodu 1, traceback yok.</w:t>
+            </w:r>
           </w:p>
         </w:tc>
         <w:tc>
@@ -14092,6 +14271,9 @@
             <w:pPr>
               <w:spacing w:after="0"/>
             </w:pPr>
+            <w:r>
+              <w:t>G</w:t>
+            </w:r>
           </w:p>
         </w:tc>
       </w:tr>
@@ -14400,6 +14582,9 @@
             <w:pPr>
               <w:spacing w:after="0"/>
             </w:pPr>
+            <w:r>
+              <w:t>4</w:t>
+            </w:r>
           </w:p>
         </w:tc>
         <w:tc>
@@ -14422,6 +14607,9 @@
             <w:pPr>
               <w:spacing w:after="0"/>
             </w:pPr>
+            <w:r>
+              <w:t>0</w:t>
+            </w:r>
           </w:p>
         </w:tc>
         <w:tc>
@@ -14444,6 +14632,9 @@
             <w:pPr>
               <w:spacing w:after="0"/>
             </w:pPr>
+            <w:r>
+              <w:t>Enes Öztürk</w:t>
+            </w:r>
           </w:p>
         </w:tc>
         <w:tc>
@@ -14466,6 +14657,9 @@
             <w:pPr>
               <w:spacing w:after="0"/>
             </w:pPr>
+            <w:r>
+              <w:t>21/10/2026</w:t>
+            </w:r>
           </w:p>
         </w:tc>
       </w:tr>
@@ -14544,6 +14738,9 @@
             <w:pPr>
               <w:spacing w:after="0"/>
             </w:pPr>
+            <w:r>
+              <w:t>5</w:t>
+            </w:r>
           </w:p>
         </w:tc>
         <w:tc>
@@ -14566,6 +14763,9 @@
             <w:pPr>
               <w:spacing w:after="0"/>
             </w:pPr>
+            <w:r>
+              <w:t>0</w:t>
+            </w:r>
           </w:p>
         </w:tc>
         <w:tc>
@@ -14588,6 +14788,9 @@
             <w:pPr>
               <w:spacing w:after="0"/>
             </w:pPr>
+            <w:r>
+              <w:t>Enes Öztürk</w:t>
+            </w:r>
           </w:p>
         </w:tc>
         <w:tc>
@@ -14610,6 +14813,9 @@
             <w:pPr>
               <w:spacing w:after="0"/>
             </w:pPr>
+            <w:r>
+              <w:t>21/10/2026</w:t>
+            </w:r>
           </w:p>
         </w:tc>
       </w:tr>
@@ -14689,6 +14895,9 @@
             <w:pPr>
               <w:spacing w:after="0"/>
             </w:pPr>
+            <w:r>
+              <w:t>4</w:t>
+            </w:r>
           </w:p>
         </w:tc>
         <w:tc>
@@ -14711,6 +14920,9 @@
             <w:pPr>
               <w:spacing w:after="0"/>
             </w:pPr>
+            <w:r>
+              <w:t>0</w:t>
+            </w:r>
           </w:p>
         </w:tc>
         <w:tc>
@@ -14733,6 +14945,9 @@
             <w:pPr>
               <w:spacing w:after="0"/>
             </w:pPr>
+            <w:r>
+              <w:t>Enes Öztürk</w:t>
+            </w:r>
           </w:p>
         </w:tc>
         <w:tc>
@@ -14755,6 +14970,9 @@
             <w:pPr>
               <w:spacing w:after="0"/>
             </w:pPr>
+            <w:r>
+              <w:t>21/10/2026</w:t>
+            </w:r>
           </w:p>
         </w:tc>
       </w:tr>
@@ -14833,6 +15051,9 @@
             <w:pPr>
               <w:spacing w:after="0"/>
             </w:pPr>
+            <w:r>
+              <w:t>4</w:t>
+            </w:r>
           </w:p>
         </w:tc>
         <w:tc>
@@ -14855,6 +15076,9 @@
             <w:pPr>
               <w:spacing w:after="0"/>
             </w:pPr>
+            <w:r>
+              <w:t>0</w:t>
+            </w:r>
           </w:p>
         </w:tc>
         <w:tc>
@@ -14877,6 +15101,9 @@
             <w:pPr>
               <w:spacing w:after="0"/>
             </w:pPr>
+            <w:r>
+              <w:t>Enes Öztürk</w:t>
+            </w:r>
           </w:p>
         </w:tc>
         <w:tc>
@@ -14899,6 +15126,9 @@
             <w:pPr>
               <w:spacing w:after="0"/>
             </w:pPr>
+            <w:r>
+              <w:t>21/10/2026</w:t>
+            </w:r>
           </w:p>
         </w:tc>
       </w:tr>
@@ -14977,6 +15207,9 @@
             <w:pPr>
               <w:spacing w:after="0"/>
             </w:pPr>
+            <w:r>
+              <w:t>4</w:t>
+            </w:r>
           </w:p>
         </w:tc>
         <w:tc>
@@ -14999,6 +15232,9 @@
             <w:pPr>
               <w:spacing w:after="0"/>
             </w:pPr>
+            <w:r>
+              <w:t>0</w:t>
+            </w:r>
           </w:p>
         </w:tc>
         <w:tc>
@@ -15021,6 +15257,9 @@
             <w:pPr>
               <w:spacing w:after="0"/>
             </w:pPr>
+            <w:r>
+              <w:t>Enes Öztürk</w:t>
+            </w:r>
           </w:p>
         </w:tc>
         <w:tc>
@@ -15043,6 +15282,9 @@
             <w:pPr>
               <w:spacing w:after="0"/>
             </w:pPr>
+            <w:r>
+              <w:t>21/10/2026</w:t>
+            </w:r>
           </w:p>
         </w:tc>
       </w:tr>
@@ -15265,6 +15507,9 @@
             <w:pPr>
               <w:spacing w:after="0"/>
             </w:pPr>
+            <w:r>
+              <w:t>4</w:t>
+            </w:r>
           </w:p>
         </w:tc>
         <w:tc>
@@ -15287,6 +15532,9 @@
             <w:pPr>
               <w:spacing w:after="0"/>
             </w:pPr>
+            <w:r>
+              <w:t>0</w:t>
+            </w:r>
           </w:p>
         </w:tc>
         <w:tc>
@@ -15309,6 +15557,9 @@
             <w:pPr>
               <w:spacing w:after="0"/>
             </w:pPr>
+            <w:r>
+              <w:t>Enes Öztürk</w:t>
+            </w:r>
           </w:p>
         </w:tc>
         <w:tc>
@@ -15331,6 +15582,9 @@
             <w:pPr>
               <w:spacing w:after="0"/>
             </w:pPr>
+            <w:r>
+              <w:t>21/10/2026</w:t>
+            </w:r>
           </w:p>
         </w:tc>
       </w:tr>
@@ -15553,6 +15807,9 @@
             <w:pPr>
               <w:spacing w:after="0"/>
             </w:pPr>
+            <w:r>
+              <w:t>4</w:t>
+            </w:r>
           </w:p>
         </w:tc>
         <w:tc>
@@ -15575,6 +15832,9 @@
             <w:pPr>
               <w:spacing w:after="0"/>
             </w:pPr>
+            <w:r>
+              <w:t>0</w:t>
+            </w:r>
           </w:p>
         </w:tc>
         <w:tc>
@@ -15597,6 +15857,9 @@
             <w:pPr>
               <w:spacing w:after="0"/>
             </w:pPr>
+            <w:r>
+              <w:t>Enes Öztürk</w:t>
+            </w:r>
           </w:p>
         </w:tc>
         <w:tc>
@@ -15619,6 +15882,9 @@
             <w:pPr>
               <w:spacing w:after="0"/>
             </w:pPr>
+            <w:r>
+              <w:t>21/10/2026</w:t>
+            </w:r>
           </w:p>
         </w:tc>
       </w:tr>

</xml_diff>

<commit_message>
docs(std): record 3.6 and 3.8 test logs on Windows
Fill the 3.6 (RL) and 3.8 (batch) log tables, the 4.3 summary and the 4.1
environment from a scripted run of the real MainWindow on Windows 10, with
screenshots, raw results and the driver script under docs/std/v0.3.1/.

Co-Authored-By: Claude Sonnet 5.5 <noreply@anthropic.com>
</commit_message>
<xml_diff>
--- a/docs/TestZede-STD.docx
+++ b/docs/TestZede-STD.docx
@@ -8580,15 +8580,15 @@
               <w:spacing w:after="0"/>
             </w:pPr>
             <w:r>
-              <w:t>İşletim sistemi: macOS 27.0   Python sürümü: 3.11.16   Yazılım sürümü: v0.3.1 adayı (develop 75f0665 + PR #27)</w:t>
-            </w:r>
-          </w:p>
-          <w:p>
-            <w:pPr>
-              <w:spacing w:after="0"/>
-            </w:pPr>
-            <w:r>
-              <w:t>3.1–3.5 ve 3.7: arayüz (MainWindow) STD girdileriyle Qt üzerinden betikle sürüldü; “Dosya Aç” / “CSV’ye Aktar…” iletişim kutularının seçtiği yol doğrudan verildi. 3.9: komut satırı, boş bir veri klasöründe (--data-dir). Ekran görüntüleri ve ham sonuçlar: docs/std/v0.3.1/. 3.6 ve 3.8 çapraz test kuralı gereği Burak Arıkan tarafından (Windows) doldurulacak.</w:t>
+              <w:t>İşletim sistemi: macOS 27.0 (Enes), Windows 10 Pro 10.0.19045 (Burak)   Python sürümü: 3.11.16   Yazılım sürümü: v0.3.1 adayı (develop 09493e4)</w:t>
+            </w:r>
+          </w:p>
+          <w:p>
+            <w:pPr>
+              <w:spacing w:after="0"/>
+            </w:pPr>
+            <w:r>
+              <w:t>3.1–3.5 ve 3.7: arayüz (MainWindow) STD girdileriyle Qt üzerinden betikle sürüldü; “Dosya Aç” / “CSV’ye Aktar…” iletişim kutularının seçtiği yol doğrudan verildi. 3.9: komut satırı, boş bir veri klasöründe (--data-dir). Ekran görüntüleri ve ham sonuçlar: docs/std/v0.3.1/. 3.6 ve 3.8 (Windows, Burak Arıkan): aynı yöntemle betikle sürüldü (docs/std/v0.3.1/run_std_gui_36_38.py; sonuçlar results_36_38.json); “Testleri Kaydet…” iletişim kutusunun yolu doğrudan verildi, kaydedilen dosya pytest ile çalıştırıldı. Veriler indirilmiş ve make-splits çalıştırılmış durumdaydı.</w:t>
             </w:r>
           </w:p>
         </w:tc>
@@ -8645,7 +8645,7 @@
               <w:spacing w:after="0"/>
             </w:pPr>
             <w:r>
-              <w:t>Enes Öztürk (3.1–3.5, 3.7, 3.9)   21/10/2026</w:t>
+              <w:t>Enes Öztürk (3.1–3.5, 3.7, 3.9), Burak Arıkan (3.6, 3.8)   21/10/2026</w:t>
             </w:r>
           </w:p>
         </w:tc>
@@ -12053,6 +12053,9 @@
             <w:pPr>
               <w:spacing w:after="0"/>
             </w:pPr>
+            <w:r>
+              <w:t>Tamam: 4 test üretildi (7 adım); test_step_001 vb. listede, test kodu görüntülendi.</w:t>
+            </w:r>
           </w:p>
         </w:tc>
         <w:tc>
@@ -12075,6 +12078,9 @@
             <w:pPr>
               <w:spacing w:after="0"/>
             </w:pPr>
+            <w:r>
+              <w:t>G</w:t>
+            </w:r>
           </w:p>
         </w:tc>
       </w:tr>
@@ -12154,6 +12160,9 @@
             <w:pPr>
               <w:spacing w:after="0"/>
             </w:pPr>
+            <w:r>
+              <w:t>Tamam: Test Case Statistics 4 (üretilen 21, derlenen 21), Branch Count 4 / 4, Tested Line Count 6 / 6, Coverage Rate %100. T1a ile tekrarda: 4 test, %100 (kullanıcı testleri %50 → + RL).</w:t>
+            </w:r>
           </w:p>
         </w:tc>
         <w:tc>
@@ -12176,6 +12185,9 @@
             <w:pPr>
               <w:spacing w:after="0"/>
             </w:pPr>
+            <w:r>
+              <w:t>G</w:t>
+            </w:r>
           </w:p>
         </w:tc>
       </w:tr>
@@ -12255,6 +12267,9 @@
             <w:pPr>
               <w:spacing w:after="0"/>
             </w:pPr>
+            <w:r>
+              <w:t>Tamam: Coverage Rate %100 (6/6 satır, 4/4 dal); T1a’lı çalıştırmada da %100.</w:t>
+            </w:r>
           </w:p>
         </w:tc>
         <w:tc>
@@ -12277,6 +12292,9 @@
             <w:pPr>
               <w:spacing w:after="0"/>
             </w:pPr>
+            <w:r>
+              <w:t>G</w:t>
+            </w:r>
           </w:p>
         </w:tc>
       </w:tr>
@@ -12356,6 +12374,9 @@
             <w:pPr>
               <w:spacing w:after="0"/>
             </w:pPr>
+            <w:r>
+              <w:t>Tamam: “Testleri Kaydet…” ile kaydedilen test_sign.py pytest ile “4 passed”.</w:t>
+            </w:r>
           </w:p>
         </w:tc>
         <w:tc>
@@ -12378,6 +12399,9 @@
             <w:pPr>
               <w:spacing w:after="0"/>
             </w:pPr>
+            <w:r>
+              <w:t>G</w:t>
+            </w:r>
           </w:p>
         </w:tc>
       </w:tr>
@@ -12457,6 +12481,9 @@
             <w:pPr>
               <w:spacing w:after="0"/>
             </w:pPr>
+            <w:r>
+              <w:t>Tamam: üretim sırasında arayüz yanıt verdi (olay döngüsünde en uzun kesinti 0,03 sn), yakalanmamış istisna 0.</w:t>
+            </w:r>
           </w:p>
         </w:tc>
         <w:tc>
@@ -12479,6 +12506,9 @@
             <w:pPr>
               <w:spacing w:after="0"/>
             </w:pPr>
+            <w:r>
+              <w:t>G</w:t>
+            </w:r>
           </w:p>
         </w:tc>
       </w:tr>
@@ -13343,6 +13373,9 @@
             <w:pPr>
               <w:spacing w:after="0"/>
             </w:pPr>
+            <w:r>
+              <w:t>Tamam: ilerleme çubuğu 1/10’dan 10/10’a, tablo satır satır ilerledi; 10 birim, 0 hatalı. Not: birim sınırı veri seti başına uygulandığı için “Split: external” 10 birim (5 HumanEval + 5 small67) çalıştırdı.</w:t>
+            </w:r>
           </w:p>
         </w:tc>
         <w:tc>
@@ -13365,6 +13398,9 @@
             <w:pPr>
               <w:spacing w:after="0"/>
             </w:pPr>
+            <w:r>
+              <w:t>G</w:t>
+            </w:r>
           </w:p>
         </w:tc>
       </w:tr>
@@ -13444,6 +13480,9 @@
             <w:pPr>
               <w:spacing w:after="0"/>
             </w:pPr>
+            <w:r>
+              <w:t>Tamam: reports/2026-10-21/humaneval ve small67 altında results, summary, meta CSV; report.xlsx; report.html (toplam 10 dosya).</w:t>
+            </w:r>
           </w:p>
         </w:tc>
         <w:tc>
@@ -13466,6 +13505,9 @@
             <w:pPr>
               <w:spacing w:after="0"/>
             </w:pPr>
+            <w:r>
+              <w:t>G</w:t>
+            </w:r>
           </w:p>
         </w:tc>
       </w:tr>
@@ -13545,6 +13587,9 @@
             <w:pPr>
               <w:spacing w:after="0"/>
             </w:pPr>
+            <w:r>
+              <w:t>Tamam: external.json SHA-256’sı (d91c0131…2df8df) meta.csv, report.html ve report.xlsx içinde yazıyor.</w:t>
+            </w:r>
           </w:p>
         </w:tc>
         <w:tc>
@@ -13567,6 +13612,9 @@
             <w:pPr>
               <w:spacing w:after="0"/>
             </w:pPr>
+            <w:r>
+              <w:t>G</w:t>
+            </w:r>
           </w:p>
         </w:tc>
       </w:tr>
@@ -13646,6 +13694,9 @@
             <w:pPr>
               <w:spacing w:after="0"/>
             </w:pPr>
+            <w:r>
+              <w:t>Tamam: ilk satır görününce “Durdur”a basıldı; “Durduruluyor…” görüldü, mevcut birim bitince “Durduruldu: 2 birim, 0 hatalı” ile kesildi; arayüz yanıt verdi.</w:t>
+            </w:r>
           </w:p>
         </w:tc>
         <w:tc>
@@ -13668,6 +13719,9 @@
             <w:pPr>
               <w:spacing w:after="0"/>
             </w:pPr>
+            <w:r>
+              <w:t>G</w:t>
+            </w:r>
           </w:p>
         </w:tc>
       </w:tr>
@@ -15363,6 +15417,9 @@
             <w:pPr>
               <w:spacing w:after="0"/>
             </w:pPr>
+            <w:r>
+              <w:t>5</w:t>
+            </w:r>
           </w:p>
         </w:tc>
         <w:tc>
@@ -15385,6 +15442,9 @@
             <w:pPr>
               <w:spacing w:after="0"/>
             </w:pPr>
+            <w:r>
+              <w:t>0</w:t>
+            </w:r>
           </w:p>
         </w:tc>
         <w:tc>
@@ -15407,6 +15467,9 @@
             <w:pPr>
               <w:spacing w:after="0"/>
             </w:pPr>
+            <w:r>
+              <w:t>Burak Arıkan</w:t>
+            </w:r>
           </w:p>
         </w:tc>
         <w:tc>
@@ -15429,6 +15492,9 @@
             <w:pPr>
               <w:spacing w:after="0"/>
             </w:pPr>
+            <w:r>
+              <w:t>21/10/2026</w:t>
+            </w:r>
           </w:p>
         </w:tc>
       </w:tr>
@@ -15663,6 +15729,9 @@
             <w:pPr>
               <w:spacing w:after="0"/>
             </w:pPr>
+            <w:r>
+              <w:t>4</w:t>
+            </w:r>
           </w:p>
         </w:tc>
         <w:tc>
@@ -15685,6 +15754,9 @@
             <w:pPr>
               <w:spacing w:after="0"/>
             </w:pPr>
+            <w:r>
+              <w:t>0</w:t>
+            </w:r>
           </w:p>
         </w:tc>
         <w:tc>
@@ -15707,6 +15779,9 @@
             <w:pPr>
               <w:spacing w:after="0"/>
             </w:pPr>
+            <w:r>
+              <w:t>Burak Arıkan</w:t>
+            </w:r>
           </w:p>
         </w:tc>
         <w:tc>
@@ -15729,6 +15804,9 @@
             <w:pPr>
               <w:spacing w:after="0"/>
             </w:pPr>
+            <w:r>
+              <w:t>21/10/2026</w:t>
+            </w:r>
           </w:p>
         </w:tc>
       </w:tr>

</xml_diff>

<commit_message>
docs(std): repeat 3.1-3.5, 3.7 and 3.9 on Windows; align STD 1.2
Run Enes's GUI driver and the 3.9 CLI steps on Windows 10; status texts match
the macOS run and the split SHA-256s are identical. STD 1.2 and 4.1 now state
which cases ran on which platform. Evidence in docs/std/v0.3.1/windows/.

Co-Authored-By: Claude Sonnet 5.5 <noreply@anthropic.com>
</commit_message>
<xml_diff>
--- a/docs/TestZede-STD.docx
+++ b/docs/TestZede-STD.docx
@@ -1445,7 +1445,7 @@
         <w:jc w:val="both"/>
       </w:pPr>
       <w:r>
-        <w:t>Testler, desteklenen iki platformda (Windows 10 ve üzeri, macOS) Python 3.11 ile yapılır. Her test case’i, kendi geliştirmediği modülü test edecek şekilde ekip üyeleri tarafından çapraz olarak (manuel) uygulanır; sonuçlar 4. bölümdeki tablolara işlenir.</w:t>
+        <w:t>Testler, desteklenen iki platformda (Windows 10 ve üzeri, macOS) Python 3.11 ile yapılır. Her test case’i, kendi geliştirmediği modülü test edecek şekilde ekip üyeleri tarafından çapraz olarak (manuel) uygulanır. 3.1–3.5, 3.7 ve 3.9 her iki platformda, 3.6 ve 3.8 Windows’ta koşulmuştur; sonuçlar 4. bölümdeki tablolara işlenir.</w:t>
       </w:r>
     </w:p>
     <w:p>
@@ -8588,7 +8588,7 @@
               <w:spacing w:after="0"/>
             </w:pPr>
             <w:r>
-              <w:t>3.1–3.5 ve 3.7: arayüz (MainWindow) STD girdileriyle Qt üzerinden betikle sürüldü; “Dosya Aç” / “CSV’ye Aktar…” iletişim kutularının seçtiği yol doğrudan verildi. 3.9: komut satırı, boş bir veri klasöründe (--data-dir). Ekran görüntüleri ve ham sonuçlar: docs/std/v0.3.1/. 3.6 ve 3.8 (Windows, Burak Arıkan): aynı yöntemle betikle sürüldü (docs/std/v0.3.1/run_std_gui_36_38.py; sonuçlar results_36_38.json); “Testleri Kaydet…” iletişim kutusunun yolu doğrudan verildi, kaydedilen dosya pytest ile çalıştırıldı. Veriler indirilmiş ve make-splits çalıştırılmış durumdaydı.</w:t>
+              <w:t>3.1–3.5 ve 3.7: arayüz (MainWindow) STD girdileriyle Qt üzerinden betikle sürüldü; “Dosya Aç” / “CSV’ye Aktar…” iletişim kutularının seçtiği yol doğrudan verildi. 3.9: komut satırı, boş bir veri klasöründe (--data-dir). Ekran görüntüleri ve ham sonuçlar: docs/std/v0.3.1/. 3.6 ve 3.8 (Windows, Burak Arıkan): aynı yöntemle betikle sürüldü (docs/std/v0.3.1/run_std_gui_36_38.py; sonuçlar results_36_38.json); “Testleri Kaydet…” iletişim kutusunun yolu doğrudan verildi, kaydedilen dosya pytest ile çalıştırıldı. Veriler indirilmiş ve make-splits çalıştırılmış durumdaydı. 3.1–3.5, 3.7 ve 3.9 ayrıca Windows’ta (Burak Arıkan, 23/10/2026, v0.3.2 kodu) aynı betik ve komutlarla tekrarlandı: durum sonuçları macOS ile aynı; üç ayrım dosyasının SHA-256’ları iki platformda aynı. Kanıtlar: docs/std/v0.3.1/windows/.</w:t>
             </w:r>
           </w:p>
         </w:tc>
@@ -8645,7 +8645,7 @@
               <w:spacing w:after="0"/>
             </w:pPr>
             <w:r>
-              <w:t>Enes Öztürk (3.1–3.5, 3.7, 3.9), Burak Arıkan (3.6, 3.8)   21/10/2026</w:t>
+              <w:t>Enes Öztürk (3.1–3.5, 3.7, 3.9; macOS), Burak Arıkan (3.6, 3.8; 3.1–3.5, 3.7, 3.9 Windows tekrarı)   21/10/2026 (Windows tekrarı: 23/10/2026)</w:t>
             </w:r>
           </w:p>
         </w:tc>

</xml_diff>